<commit_message>
Fix copy-paste bug: "sidra" left over in Beer/Mead proctor instructions
Beer-proctor-instructions-pt-br.docx and both Mead-proctor-instructions
variants referred to the sample as "sidra" (cider) instead of the
correct beverage, apparently copy-pasted from the Cider version without
replacing every occurrence -- including a gender-agreement error
("avaliar a sidra" carried over as "avaliar a cerveja" instead of "o
hidromel" would need masculine agreement). Fixed all instances per file,
respecting each beverage's grammatical gender.

Co-Authored-By: Claude Sonnet 5 <noreply@anthropic.com>
</commit_message>
<xml_diff>
--- a/cerveja/exame-julgamento/Beer-proctor-instructions-pt-br.docx
+++ b/cerveja/exame-julgamento/Beer-proctor-instructions-pt-br.docx
@@ -98,241 +98,215 @@
           <w:szCs w:val="22"/>
           <w:lang w:val="pt-BR"/>
         </w:rPr>
-        <w:t xml:space="preserve">Seu objetivo como </w:t>
-      </w:r>
-      <w:r>
-        <w:rPr>
-          <w:rFonts w:ascii="Arial" w:hAnsi="Arial" w:cs="Arial"/>
-          <w:sz w:val="22"/>
-          <w:szCs w:val="22"/>
-          <w:lang w:val="pt-BR"/>
-        </w:rPr>
-        <w:t>P</w:t>
-      </w:r>
-      <w:r>
-        <w:rPr>
-          <w:rFonts w:ascii="Arial" w:hAnsi="Arial" w:cs="Arial"/>
-          <w:sz w:val="22"/>
-          <w:szCs w:val="22"/>
-          <w:lang w:val="pt-BR"/>
-        </w:rPr>
-        <w:t xml:space="preserve">roctor do exame </w:t>
-      </w:r>
-      <w:r>
-        <w:rPr>
-          <w:rFonts w:ascii="Arial" w:hAnsi="Arial" w:cs="Arial"/>
-          <w:sz w:val="22"/>
-          <w:szCs w:val="22"/>
-          <w:lang w:val="pt-BR"/>
-        </w:rPr>
-        <w:t xml:space="preserve">do </w:t>
-      </w:r>
-      <w:r>
-        <w:rPr>
-          <w:rFonts w:ascii="Arial" w:hAnsi="Arial" w:cs="Arial"/>
-          <w:sz w:val="22"/>
-          <w:szCs w:val="22"/>
-          <w:lang w:val="pt-BR"/>
-        </w:rPr>
-        <w:t xml:space="preserve">BJCP é ser os olhos, nariz e palato dos corretores do exame que avaliarão os </w:t>
-      </w:r>
-      <w:r>
-        <w:rPr>
-          <w:rFonts w:ascii="Arial" w:hAnsi="Arial" w:cs="Arial"/>
-          <w:sz w:val="22"/>
-          <w:szCs w:val="22"/>
-          <w:lang w:val="pt-BR"/>
-        </w:rPr>
-        <w:t>Candidatos</w:t>
-      </w:r>
-      <w:r>
-        <w:rPr>
-          <w:rFonts w:ascii="Arial" w:hAnsi="Arial" w:cs="Arial"/>
-          <w:sz w:val="22"/>
-          <w:szCs w:val="22"/>
-          <w:lang w:val="pt-BR"/>
-        </w:rPr>
-        <w:t xml:space="preserve"> usando </w:t>
-      </w:r>
-      <w:r>
-        <w:rPr>
-          <w:rFonts w:ascii="Arial" w:hAnsi="Arial" w:cs="Arial"/>
-          <w:sz w:val="22"/>
-          <w:szCs w:val="22"/>
-          <w:lang w:val="pt-BR"/>
-        </w:rPr>
-        <w:t xml:space="preserve">a </w:t>
-      </w:r>
-      <w:r>
-        <w:rPr>
-          <w:rFonts w:ascii="Arial" w:hAnsi="Arial" w:cs="Arial"/>
-          <w:sz w:val="22"/>
-          <w:szCs w:val="22"/>
-          <w:lang w:val="pt-BR"/>
-        </w:rPr>
-        <w:t xml:space="preserve">sua percepção das sidras do exame. Embora você deva sempre se esforçar para gerar </w:t>
-      </w:r>
-      <w:r>
-        <w:rPr>
-          <w:rFonts w:ascii="Arial" w:hAnsi="Arial" w:cs="Arial"/>
-          <w:sz w:val="22"/>
-          <w:szCs w:val="22"/>
-          <w:lang w:val="pt-BR"/>
-        </w:rPr>
-        <w:t>súmulas</w:t>
-      </w:r>
-      <w:r>
-        <w:rPr>
-          <w:rFonts w:ascii="Arial" w:hAnsi="Arial" w:cs="Arial"/>
-          <w:sz w:val="22"/>
-          <w:szCs w:val="22"/>
-          <w:lang w:val="pt-BR"/>
-        </w:rPr>
-        <w:t xml:space="preserve"> de pontuação adequadas e completas, é especialmente importante quando você é </w:t>
-      </w:r>
-      <w:r>
-        <w:rPr>
-          <w:rFonts w:ascii="Arial" w:hAnsi="Arial" w:cs="Arial"/>
-          <w:sz w:val="22"/>
-          <w:szCs w:val="22"/>
-          <w:lang w:val="pt-BR"/>
-        </w:rPr>
-        <w:t>Proctor</w:t>
-      </w:r>
-      <w:r>
-        <w:rPr>
-          <w:rFonts w:ascii="Arial" w:hAnsi="Arial" w:cs="Arial"/>
-          <w:sz w:val="22"/>
-          <w:szCs w:val="22"/>
-          <w:lang w:val="pt-BR"/>
-        </w:rPr>
-        <w:t xml:space="preserve"> de um exame, pois os </w:t>
-      </w:r>
-      <w:r>
-        <w:rPr>
-          <w:rFonts w:ascii="Arial" w:hAnsi="Arial" w:cs="Arial"/>
-          <w:sz w:val="22"/>
-          <w:szCs w:val="22"/>
-          <w:lang w:val="pt-BR"/>
-        </w:rPr>
-        <w:t>corretores</w:t>
-      </w:r>
-      <w:r>
-        <w:rPr>
-          <w:rFonts w:ascii="Arial" w:hAnsi="Arial" w:cs="Arial"/>
-          <w:sz w:val="22"/>
-          <w:szCs w:val="22"/>
-          <w:lang w:val="pt-BR"/>
-        </w:rPr>
-        <w:t xml:space="preserve"> não poderão avaliar a sidra para a qual você e os </w:t>
-      </w:r>
-      <w:r>
-        <w:rPr>
-          <w:rFonts w:ascii="Arial" w:hAnsi="Arial" w:cs="Arial"/>
-          <w:sz w:val="22"/>
-          <w:szCs w:val="22"/>
-          <w:lang w:val="pt-BR"/>
-        </w:rPr>
-        <w:t>Candidatos</w:t>
-      </w:r>
-      <w:r>
-        <w:rPr>
-          <w:rFonts w:ascii="Arial" w:hAnsi="Arial" w:cs="Arial"/>
-          <w:sz w:val="22"/>
-          <w:szCs w:val="22"/>
-          <w:lang w:val="pt-BR"/>
-        </w:rPr>
-        <w:t xml:space="preserve"> estão escrevendo </w:t>
-      </w:r>
-      <w:r>
-        <w:rPr>
-          <w:rFonts w:ascii="Arial" w:hAnsi="Arial" w:cs="Arial"/>
-          <w:sz w:val="22"/>
-          <w:szCs w:val="22"/>
-          <w:lang w:val="pt-BR"/>
-        </w:rPr>
-        <w:t>súmulas</w:t>
-      </w:r>
-      <w:r>
-        <w:rPr>
-          <w:rFonts w:ascii="Arial" w:hAnsi="Arial" w:cs="Arial"/>
-          <w:sz w:val="22"/>
-          <w:szCs w:val="22"/>
-          <w:lang w:val="pt-BR"/>
-        </w:rPr>
-        <w:t xml:space="preserve"> de </w:t>
-      </w:r>
-      <w:r>
-        <w:rPr>
-          <w:rFonts w:ascii="Arial" w:hAnsi="Arial" w:cs="Arial"/>
-          <w:sz w:val="22"/>
-          <w:szCs w:val="22"/>
-          <w:lang w:val="pt-BR"/>
-        </w:rPr>
-        <w:t>avaliação</w:t>
-      </w:r>
-      <w:r>
-        <w:rPr>
-          <w:rFonts w:ascii="Arial" w:hAnsi="Arial" w:cs="Arial"/>
-          <w:sz w:val="22"/>
-          <w:szCs w:val="22"/>
-          <w:lang w:val="pt-BR"/>
-        </w:rPr>
-        <w:t xml:space="preserve">. Fazer um trabalho ruim nas </w:t>
-      </w:r>
-      <w:r>
-        <w:rPr>
-          <w:rFonts w:ascii="Arial" w:hAnsi="Arial" w:cs="Arial"/>
-          <w:sz w:val="22"/>
-          <w:szCs w:val="22"/>
-          <w:lang w:val="pt-BR"/>
-        </w:rPr>
-        <w:t>súmulas</w:t>
-      </w:r>
-      <w:r>
-        <w:rPr>
-          <w:rFonts w:ascii="Arial" w:hAnsi="Arial" w:cs="Arial"/>
-          <w:sz w:val="22"/>
-          <w:szCs w:val="22"/>
-          <w:lang w:val="pt-BR"/>
-        </w:rPr>
-        <w:t xml:space="preserve"> </w:t>
-      </w:r>
-      <w:r>
-        <w:rPr>
-          <w:rFonts w:ascii="Arial" w:hAnsi="Arial" w:cs="Arial"/>
-          <w:sz w:val="22"/>
-          <w:szCs w:val="22"/>
-          <w:lang w:val="pt-BR"/>
-        </w:rPr>
-        <w:t xml:space="preserve">de </w:t>
-      </w:r>
-      <w:r>
-        <w:rPr>
-          <w:rFonts w:ascii="Arial" w:hAnsi="Arial" w:cs="Arial"/>
-          <w:sz w:val="22"/>
-          <w:szCs w:val="22"/>
-          <w:lang w:val="pt-BR"/>
-        </w:rPr>
-        <w:t>P</w:t>
-      </w:r>
-      <w:r>
-        <w:rPr>
-          <w:rFonts w:ascii="Arial" w:hAnsi="Arial" w:cs="Arial"/>
-          <w:sz w:val="22"/>
-          <w:szCs w:val="22"/>
-          <w:lang w:val="pt-BR"/>
-        </w:rPr>
-        <w:t>roctor</w:t>
-      </w:r>
-      <w:r>
-        <w:rPr>
-          <w:rFonts w:ascii="Arial" w:hAnsi="Arial" w:cs="Arial"/>
-          <w:sz w:val="22"/>
-          <w:szCs w:val="22"/>
-          <w:lang w:val="pt-BR"/>
-        </w:rPr>
-        <w:t xml:space="preserve"> é um desserviço </w:t>
+        <w:t>Seu objetivo como Proctor do exame do BJCP é ser os olhos, nariz e palato dos corretores do exame que avaliarão os Candidatos usando a sua percepção das cervejas do exame. Embora você deva sempre se esforçar para gerar súmulas de pontuação adequadas e completas, é especialmente importante quando você é Proctor de um exame, pois os corretores não poderão avaliar a cerveja para a qual você e os Candidatos estão escrevendo súmulas de avaliação. Fazer um trabalho ruim nas súmulas de Proctor é um desserviço à todos que fazem o exame com você.</w:t>
+      </w:r>
+      <w:r>
+        <w:rPr>
+          <w:rFonts w:ascii="Arial" w:hAnsi="Arial" w:cs="Arial"/>
+          <w:sz w:val="22"/>
+          <w:szCs w:val="22"/>
+          <w:lang w:val="pt-BR"/>
+        </w:rPr>
+      </w:r>
+      <w:r>
+        <w:rPr>
+          <w:rFonts w:ascii="Arial" w:hAnsi="Arial" w:cs="Arial"/>
+          <w:sz w:val="22"/>
+          <w:szCs w:val="22"/>
+          <w:lang w:val="pt-BR"/>
+        </w:rPr>
+      </w:r>
+      <w:r>
+        <w:rPr>
+          <w:rFonts w:ascii="Arial" w:hAnsi="Arial" w:cs="Arial"/>
+          <w:sz w:val="22"/>
+          <w:szCs w:val="22"/>
+          <w:lang w:val="pt-BR"/>
+        </w:rPr>
+      </w:r>
+      <w:r>
+        <w:rPr>
+          <w:rFonts w:ascii="Arial" w:hAnsi="Arial" w:cs="Arial"/>
+          <w:sz w:val="22"/>
+          <w:szCs w:val="22"/>
+          <w:lang w:val="pt-BR"/>
+        </w:rPr>
+      </w:r>
+      <w:r>
+        <w:rPr>
+          <w:rFonts w:ascii="Arial" w:hAnsi="Arial" w:cs="Arial"/>
+          <w:sz w:val="22"/>
+          <w:szCs w:val="22"/>
+          <w:lang w:val="pt-BR"/>
+        </w:rPr>
+      </w:r>
+      <w:r>
+        <w:rPr>
+          <w:rFonts w:ascii="Arial" w:hAnsi="Arial" w:cs="Arial"/>
+          <w:sz w:val="22"/>
+          <w:szCs w:val="22"/>
+          <w:lang w:val="pt-BR"/>
+        </w:rPr>
+      </w:r>
+      <w:r>
+        <w:rPr>
+          <w:rFonts w:ascii="Arial" w:hAnsi="Arial" w:cs="Arial"/>
+          <w:sz w:val="22"/>
+          <w:szCs w:val="22"/>
+          <w:lang w:val="pt-BR"/>
+        </w:rPr>
+      </w:r>
+      <w:r>
+        <w:rPr>
+          <w:rFonts w:ascii="Arial" w:hAnsi="Arial" w:cs="Arial"/>
+          <w:sz w:val="22"/>
+          <w:szCs w:val="22"/>
+          <w:lang w:val="pt-BR"/>
+        </w:rPr>
+      </w:r>
+      <w:r>
+        <w:rPr>
+          <w:rFonts w:ascii="Arial" w:hAnsi="Arial" w:cs="Arial"/>
+          <w:sz w:val="22"/>
+          <w:szCs w:val="22"/>
+          <w:lang w:val="pt-BR"/>
+        </w:rPr>
+      </w:r>
+      <w:r>
+        <w:rPr>
+          <w:rFonts w:ascii="Arial" w:hAnsi="Arial" w:cs="Arial"/>
+          <w:sz w:val="22"/>
+          <w:szCs w:val="22"/>
+          <w:lang w:val="pt-BR"/>
+        </w:rPr>
+      </w:r>
+      <w:r>
+        <w:rPr>
+          <w:rFonts w:ascii="Arial" w:hAnsi="Arial" w:cs="Arial"/>
+          <w:sz w:val="22"/>
+          <w:szCs w:val="22"/>
+          <w:lang w:val="pt-BR"/>
+        </w:rPr>
+      </w:r>
+      <w:r>
+        <w:rPr>
+          <w:rFonts w:ascii="Arial" w:hAnsi="Arial" w:cs="Arial"/>
+          <w:sz w:val="22"/>
+          <w:szCs w:val="22"/>
+          <w:lang w:val="pt-BR"/>
+        </w:rPr>
+      </w:r>
+      <w:r>
+        <w:rPr>
+          <w:rFonts w:ascii="Arial" w:hAnsi="Arial" w:cs="Arial"/>
+          <w:sz w:val="22"/>
+          <w:szCs w:val="22"/>
+          <w:lang w:val="pt-BR"/>
+        </w:rPr>
+      </w:r>
+      <w:r>
+        <w:rPr>
+          <w:rFonts w:ascii="Arial" w:hAnsi="Arial" w:cs="Arial"/>
+          <w:sz w:val="22"/>
+          <w:szCs w:val="22"/>
+          <w:lang w:val="pt-BR"/>
+        </w:rPr>
+      </w:r>
+      <w:r>
+        <w:rPr>
+          <w:rFonts w:ascii="Arial" w:hAnsi="Arial" w:cs="Arial"/>
+          <w:sz w:val="22"/>
+          <w:szCs w:val="22"/>
+          <w:lang w:val="pt-BR"/>
+        </w:rPr>
+      </w:r>
+      <w:r>
+        <w:rPr>
+          <w:rFonts w:ascii="Arial" w:hAnsi="Arial" w:cs="Arial"/>
+          <w:sz w:val="22"/>
+          <w:szCs w:val="22"/>
+          <w:lang w:val="pt-BR"/>
+        </w:rPr>
+      </w:r>
+      <w:r>
+        <w:rPr>
+          <w:rFonts w:ascii="Arial" w:hAnsi="Arial" w:cs="Arial"/>
+          <w:sz w:val="22"/>
+          <w:szCs w:val="22"/>
+          <w:lang w:val="pt-BR"/>
+        </w:rPr>
+      </w:r>
+      <w:r>
+        <w:rPr>
+          <w:rFonts w:ascii="Arial" w:hAnsi="Arial" w:cs="Arial"/>
+          <w:sz w:val="22"/>
+          <w:szCs w:val="22"/>
+          <w:lang w:val="pt-BR"/>
+        </w:rPr>
+      </w:r>
+      <w:r>
+        <w:rPr>
+          <w:rFonts w:ascii="Arial" w:hAnsi="Arial" w:cs="Arial"/>
+          <w:sz w:val="22"/>
+          <w:szCs w:val="22"/>
+          <w:lang w:val="pt-BR"/>
+        </w:rPr>
+      </w:r>
+      <w:r>
+        <w:rPr>
+          <w:rFonts w:ascii="Arial" w:hAnsi="Arial" w:cs="Arial"/>
+          <w:sz w:val="22"/>
+          <w:szCs w:val="22"/>
+          <w:lang w:val="pt-BR"/>
+        </w:rPr>
+      </w:r>
+      <w:r>
+        <w:rPr>
+          <w:rFonts w:ascii="Arial" w:hAnsi="Arial" w:cs="Arial"/>
+          <w:sz w:val="22"/>
+          <w:szCs w:val="22"/>
+          <w:lang w:val="pt-BR"/>
+        </w:rPr>
+      </w:r>
+      <w:r>
+        <w:rPr>
+          <w:rFonts w:ascii="Arial" w:hAnsi="Arial" w:cs="Arial"/>
+          <w:sz w:val="22"/>
+          <w:szCs w:val="22"/>
+          <w:lang w:val="pt-BR"/>
+        </w:rPr>
+      </w:r>
+      <w:r>
+        <w:rPr>
+          <w:rFonts w:ascii="Arial" w:hAnsi="Arial" w:cs="Arial"/>
+          <w:sz w:val="22"/>
+          <w:szCs w:val="22"/>
+          <w:lang w:val="pt-BR"/>
+        </w:rPr>
+      </w:r>
+      <w:r>
+        <w:rPr>
+          <w:rFonts w:ascii="Arial" w:hAnsi="Arial" w:cs="Arial"/>
+          <w:sz w:val="22"/>
+          <w:szCs w:val="22"/>
+          <w:lang w:val="pt-BR"/>
+        </w:rPr>
+      </w:r>
+      <w:r>
+        <w:rPr>
+          <w:rFonts w:ascii="Arial" w:hAnsi="Arial" w:cs="Arial"/>
+          <w:sz w:val="22"/>
+          <w:szCs w:val="22"/>
+          <w:lang w:val="pt-BR"/>
+        </w:rPr>
+      </w:r>
+      <w:r>
+        <w:rPr>
+          <w:rFonts w:ascii="Arial" w:hAnsi="Arial" w:cs="Arial"/>
+          <w:sz w:val="22"/>
+          <w:szCs w:val="22"/>
+          <w:lang w:val="pt-BR"/>
+        </w:rPr>
       </w:r>
       <w:proofErr w:type="gramStart"/>
       <w:r>
@@ -342,7 +316,6 @@
           <w:szCs w:val="22"/>
           <w:lang w:val="pt-BR"/>
         </w:rPr>
-        <w:t>à</w:t>
       </w:r>
       <w:proofErr w:type="gramEnd"/>
       <w:r>
@@ -352,7 +325,6 @@
           <w:szCs w:val="22"/>
           <w:lang w:val="pt-BR"/>
         </w:rPr>
-        <w:t xml:space="preserve"> todos que fazem o exame com você.</w:t>
       </w:r>
     </w:p>
     <w:p>
@@ -1803,475 +1775,423 @@
           <w:szCs w:val="22"/>
           <w:lang w:val="pt-BR"/>
         </w:rPr>
-        <w:t>Depois que você e o</w:t>
-      </w:r>
-      <w:r>
-        <w:rPr>
-          <w:rFonts w:ascii="Arial" w:hAnsi="Arial" w:cs="Arial"/>
-          <w:sz w:val="22"/>
-          <w:szCs w:val="22"/>
-          <w:lang w:val="pt-BR"/>
-        </w:rPr>
-        <w:t>(</w:t>
-      </w:r>
-      <w:r>
-        <w:rPr>
-          <w:rFonts w:ascii="Arial" w:hAnsi="Arial" w:cs="Arial"/>
-          <w:sz w:val="22"/>
-          <w:szCs w:val="22"/>
-          <w:lang w:val="pt-BR"/>
-        </w:rPr>
-        <w:t>s</w:t>
-      </w:r>
-      <w:r>
-        <w:rPr>
-          <w:rFonts w:ascii="Arial" w:hAnsi="Arial" w:cs="Arial"/>
-          <w:sz w:val="22"/>
-          <w:szCs w:val="22"/>
-          <w:lang w:val="pt-BR"/>
-        </w:rPr>
-        <w:t>)</w:t>
-      </w:r>
-      <w:r>
-        <w:rPr>
-          <w:rFonts w:ascii="Arial" w:hAnsi="Arial" w:cs="Arial"/>
-          <w:sz w:val="22"/>
-          <w:szCs w:val="22"/>
-          <w:lang w:val="pt-BR"/>
-        </w:rPr>
-        <w:t xml:space="preserve"> outro</w:t>
-      </w:r>
-      <w:r>
-        <w:rPr>
-          <w:rFonts w:ascii="Arial" w:hAnsi="Arial" w:cs="Arial"/>
-          <w:sz w:val="22"/>
-          <w:szCs w:val="22"/>
-          <w:lang w:val="pt-BR"/>
-        </w:rPr>
-        <w:t>(</w:t>
-      </w:r>
-      <w:r>
-        <w:rPr>
-          <w:rFonts w:ascii="Arial" w:hAnsi="Arial" w:cs="Arial"/>
-          <w:sz w:val="22"/>
-          <w:szCs w:val="22"/>
-          <w:lang w:val="pt-BR"/>
-        </w:rPr>
-        <w:t>s</w:t>
-      </w:r>
-      <w:r>
-        <w:rPr>
-          <w:rFonts w:ascii="Arial" w:hAnsi="Arial" w:cs="Arial"/>
-          <w:sz w:val="22"/>
-          <w:szCs w:val="22"/>
-          <w:lang w:val="pt-BR"/>
-        </w:rPr>
-        <w:t>)</w:t>
-      </w:r>
-      <w:r>
-        <w:rPr>
-          <w:rFonts w:ascii="Arial" w:hAnsi="Arial" w:cs="Arial"/>
-          <w:sz w:val="22"/>
-          <w:szCs w:val="22"/>
-          <w:lang w:val="pt-BR"/>
-        </w:rPr>
-        <w:t xml:space="preserve"> </w:t>
-      </w:r>
-      <w:r>
-        <w:rPr>
-          <w:rFonts w:ascii="Arial" w:hAnsi="Arial" w:cs="Arial"/>
-          <w:sz w:val="22"/>
-          <w:szCs w:val="22"/>
-          <w:lang w:val="pt-BR"/>
-        </w:rPr>
-        <w:t>P</w:t>
-      </w:r>
-      <w:r>
-        <w:rPr>
-          <w:rFonts w:ascii="Arial" w:hAnsi="Arial" w:cs="Arial"/>
-          <w:sz w:val="22"/>
-          <w:szCs w:val="22"/>
-          <w:lang w:val="pt-BR"/>
-        </w:rPr>
-        <w:t>roctor(s)</w:t>
-      </w:r>
-      <w:r>
-        <w:rPr>
-          <w:rFonts w:ascii="Arial" w:hAnsi="Arial" w:cs="Arial"/>
-          <w:sz w:val="22"/>
-          <w:szCs w:val="22"/>
-          <w:lang w:val="pt-BR"/>
-        </w:rPr>
-        <w:t xml:space="preserve"> terminarem sua</w:t>
-      </w:r>
-      <w:r>
-        <w:rPr>
-          <w:rFonts w:ascii="Arial" w:hAnsi="Arial" w:cs="Arial"/>
-          <w:sz w:val="22"/>
-          <w:szCs w:val="22"/>
-          <w:lang w:val="pt-BR"/>
-        </w:rPr>
-        <w:t>s súmulas</w:t>
-      </w:r>
-      <w:r>
-        <w:rPr>
-          <w:rFonts w:ascii="Arial" w:hAnsi="Arial" w:cs="Arial"/>
-          <w:sz w:val="22"/>
-          <w:szCs w:val="22"/>
-          <w:lang w:val="pt-BR"/>
-        </w:rPr>
-        <w:t>, você</w:t>
-      </w:r>
-      <w:r>
-        <w:rPr>
-          <w:rFonts w:ascii="Arial" w:hAnsi="Arial" w:cs="Arial"/>
-          <w:sz w:val="22"/>
-          <w:szCs w:val="22"/>
-          <w:lang w:val="pt-BR"/>
-        </w:rPr>
-        <w:t>s</w:t>
-      </w:r>
-      <w:r>
-        <w:rPr>
-          <w:rFonts w:ascii="Arial" w:hAnsi="Arial" w:cs="Arial"/>
-          <w:sz w:val="22"/>
-          <w:szCs w:val="22"/>
-          <w:lang w:val="pt-BR"/>
-        </w:rPr>
-        <w:t xml:space="preserve"> deve</w:t>
-      </w:r>
-      <w:r>
-        <w:rPr>
-          <w:rFonts w:ascii="Arial" w:hAnsi="Arial" w:cs="Arial"/>
-          <w:sz w:val="22"/>
-          <w:szCs w:val="22"/>
-          <w:lang w:val="pt-BR"/>
-        </w:rPr>
-        <w:t>m</w:t>
-      </w:r>
-      <w:r>
-        <w:rPr>
-          <w:rFonts w:ascii="Arial" w:hAnsi="Arial" w:cs="Arial"/>
-          <w:sz w:val="22"/>
-          <w:szCs w:val="22"/>
-          <w:lang w:val="pt-BR"/>
-        </w:rPr>
-        <w:t xml:space="preserve"> </w:t>
-      </w:r>
-      <w:r>
-        <w:rPr>
-          <w:rFonts w:ascii="Arial" w:hAnsi="Arial" w:cs="Arial"/>
-          <w:sz w:val="22"/>
-          <w:szCs w:val="22"/>
-          <w:lang w:val="pt-BR"/>
-        </w:rPr>
-        <w:t xml:space="preserve">chegar </w:t>
-      </w:r>
-      <w:r>
-        <w:rPr>
-          <w:rFonts w:ascii="Arial" w:hAnsi="Arial" w:cs="Arial"/>
-          <w:sz w:val="22"/>
-          <w:szCs w:val="22"/>
-          <w:lang w:val="pt-BR"/>
-        </w:rPr>
-        <w:t>em</w:t>
-      </w:r>
-      <w:r>
-        <w:rPr>
-          <w:rFonts w:ascii="Arial" w:hAnsi="Arial" w:cs="Arial"/>
-          <w:sz w:val="22"/>
-          <w:szCs w:val="22"/>
-          <w:lang w:val="pt-BR"/>
-        </w:rPr>
-        <w:t xml:space="preserve"> </w:t>
-      </w:r>
-      <w:r>
-        <w:rPr>
-          <w:rFonts w:ascii="Arial" w:hAnsi="Arial" w:cs="Arial"/>
-          <w:sz w:val="22"/>
-          <w:szCs w:val="22"/>
-          <w:lang w:val="pt-BR"/>
-        </w:rPr>
-        <w:t xml:space="preserve">uma </w:t>
-      </w:r>
-      <w:r>
-        <w:rPr>
-          <w:rFonts w:ascii="Arial" w:hAnsi="Arial" w:cs="Arial"/>
-          <w:sz w:val="22"/>
-          <w:szCs w:val="22"/>
-          <w:lang w:val="pt-BR"/>
-        </w:rPr>
-        <w:t>nota</w:t>
-      </w:r>
-      <w:r>
-        <w:rPr>
-          <w:rFonts w:ascii="Arial" w:hAnsi="Arial" w:cs="Arial"/>
-          <w:sz w:val="22"/>
-          <w:szCs w:val="22"/>
-          <w:lang w:val="pt-BR"/>
-        </w:rPr>
-        <w:t xml:space="preserve"> de consenso para </w:t>
-      </w:r>
-      <w:r>
-        <w:rPr>
-          <w:rFonts w:ascii="Arial" w:hAnsi="Arial" w:cs="Arial"/>
-          <w:sz w:val="22"/>
-          <w:szCs w:val="22"/>
-          <w:lang w:val="pt-BR"/>
-        </w:rPr>
-        <w:t>cad</w:t>
-      </w:r>
-      <w:r>
-        <w:rPr>
-          <w:rFonts w:ascii="Arial" w:hAnsi="Arial" w:cs="Arial"/>
-          <w:sz w:val="22"/>
-          <w:szCs w:val="22"/>
-          <w:lang w:val="pt-BR"/>
-        </w:rPr>
-        <w:t xml:space="preserve">a sidra/perada. Em algumas configurações de exame, por exemplo, quando os </w:t>
-      </w:r>
-      <w:r>
-        <w:rPr>
-          <w:rFonts w:ascii="Arial" w:hAnsi="Arial" w:cs="Arial"/>
-          <w:sz w:val="22"/>
-          <w:szCs w:val="22"/>
-          <w:lang w:val="pt-BR"/>
-        </w:rPr>
-        <w:t>P</w:t>
-      </w:r>
-      <w:r>
-        <w:rPr>
-          <w:rFonts w:ascii="Arial" w:hAnsi="Arial" w:cs="Arial"/>
-          <w:sz w:val="22"/>
-          <w:szCs w:val="22"/>
-          <w:lang w:val="pt-BR"/>
-        </w:rPr>
-        <w:t>roctors</w:t>
-      </w:r>
-      <w:r>
-        <w:rPr>
-          <w:rFonts w:ascii="Arial" w:hAnsi="Arial" w:cs="Arial"/>
-          <w:sz w:val="22"/>
-          <w:szCs w:val="22"/>
-          <w:lang w:val="pt-BR"/>
-        </w:rPr>
-        <w:t xml:space="preserve"> estão sentados ao lado dos </w:t>
-      </w:r>
-      <w:r>
-        <w:rPr>
-          <w:rFonts w:ascii="Arial" w:hAnsi="Arial" w:cs="Arial"/>
-          <w:sz w:val="22"/>
-          <w:szCs w:val="22"/>
-          <w:lang w:val="pt-BR"/>
-        </w:rPr>
-        <w:t>Candidatos</w:t>
-      </w:r>
-      <w:r>
-        <w:rPr>
-          <w:rFonts w:ascii="Arial" w:hAnsi="Arial" w:cs="Arial"/>
-          <w:sz w:val="22"/>
-          <w:szCs w:val="22"/>
-          <w:lang w:val="pt-BR"/>
-        </w:rPr>
-        <w:t xml:space="preserve">, pode ser melhor esperar até que o exame propriamente dito seja concluído para </w:t>
-      </w:r>
-      <w:r>
-        <w:rPr>
-          <w:rFonts w:ascii="Arial" w:hAnsi="Arial" w:cs="Arial"/>
-          <w:sz w:val="22"/>
-          <w:szCs w:val="22"/>
-          <w:lang w:val="pt-BR"/>
-        </w:rPr>
-        <w:t>atribuir</w:t>
-      </w:r>
-      <w:r>
-        <w:rPr>
-          <w:rFonts w:ascii="Arial" w:hAnsi="Arial" w:cs="Arial"/>
-          <w:sz w:val="22"/>
-          <w:szCs w:val="22"/>
-          <w:lang w:val="pt-BR"/>
-        </w:rPr>
-        <w:t xml:space="preserve"> a</w:t>
-      </w:r>
-      <w:r>
-        <w:rPr>
-          <w:rFonts w:ascii="Arial" w:hAnsi="Arial" w:cs="Arial"/>
-          <w:sz w:val="22"/>
-          <w:szCs w:val="22"/>
-          <w:lang w:val="pt-BR"/>
-        </w:rPr>
-        <w:t>s</w:t>
-      </w:r>
-      <w:r>
-        <w:rPr>
-          <w:rFonts w:ascii="Arial" w:hAnsi="Arial" w:cs="Arial"/>
-          <w:sz w:val="22"/>
-          <w:szCs w:val="22"/>
-          <w:lang w:val="pt-BR"/>
-        </w:rPr>
-        <w:t xml:space="preserve"> </w:t>
-      </w:r>
-      <w:r>
-        <w:rPr>
-          <w:rFonts w:ascii="Arial" w:hAnsi="Arial" w:cs="Arial"/>
-          <w:sz w:val="22"/>
-          <w:szCs w:val="22"/>
-          <w:lang w:val="pt-BR"/>
-        </w:rPr>
-        <w:t>notas</w:t>
-      </w:r>
-      <w:r>
-        <w:rPr>
-          <w:rFonts w:ascii="Arial" w:hAnsi="Arial" w:cs="Arial"/>
-          <w:sz w:val="22"/>
-          <w:szCs w:val="22"/>
-          <w:lang w:val="pt-BR"/>
-        </w:rPr>
-        <w:t xml:space="preserve"> </w:t>
-      </w:r>
-      <w:r>
-        <w:rPr>
-          <w:rFonts w:ascii="Arial" w:hAnsi="Arial" w:cs="Arial"/>
-          <w:sz w:val="22"/>
-          <w:szCs w:val="22"/>
-          <w:lang w:val="pt-BR"/>
-        </w:rPr>
-        <w:t xml:space="preserve">de consenso para evitar perturbar os </w:t>
-      </w:r>
-      <w:r>
-        <w:rPr>
-          <w:rFonts w:ascii="Arial" w:hAnsi="Arial" w:cs="Arial"/>
-          <w:sz w:val="22"/>
-          <w:szCs w:val="22"/>
-          <w:lang w:val="pt-BR"/>
-        </w:rPr>
-        <w:t>Candidatos</w:t>
-      </w:r>
-      <w:r>
-        <w:rPr>
-          <w:rFonts w:ascii="Arial" w:hAnsi="Arial" w:cs="Arial"/>
-          <w:sz w:val="22"/>
-          <w:szCs w:val="22"/>
-          <w:lang w:val="pt-BR"/>
-        </w:rPr>
-        <w:t xml:space="preserve"> ou divulgar inadvertidamente detalhes sobre </w:t>
-      </w:r>
-      <w:r>
-        <w:rPr>
-          <w:rFonts w:ascii="Arial" w:hAnsi="Arial" w:cs="Arial"/>
-          <w:sz w:val="22"/>
-          <w:szCs w:val="22"/>
-          <w:lang w:val="pt-BR"/>
-        </w:rPr>
-        <w:t>as amostras</w:t>
-      </w:r>
-      <w:r>
-        <w:rPr>
-          <w:rFonts w:ascii="Arial" w:hAnsi="Arial" w:cs="Arial"/>
-          <w:sz w:val="22"/>
-          <w:szCs w:val="22"/>
-          <w:lang w:val="pt-BR"/>
-        </w:rPr>
-        <w:t xml:space="preserve"> aos </w:t>
-      </w:r>
-      <w:r>
-        <w:rPr>
-          <w:rFonts w:ascii="Arial" w:hAnsi="Arial" w:cs="Arial"/>
-          <w:sz w:val="22"/>
-          <w:szCs w:val="22"/>
-          <w:lang w:val="pt-BR"/>
-        </w:rPr>
-        <w:t>Candidatos</w:t>
-      </w:r>
-      <w:r>
-        <w:rPr>
-          <w:rFonts w:ascii="Arial" w:hAnsi="Arial" w:cs="Arial"/>
-          <w:sz w:val="22"/>
-          <w:szCs w:val="22"/>
-          <w:lang w:val="pt-BR"/>
-        </w:rPr>
-        <w:t>. A</w:t>
-      </w:r>
-      <w:r>
-        <w:rPr>
-          <w:rFonts w:ascii="Arial" w:hAnsi="Arial" w:cs="Arial"/>
-          <w:sz w:val="22"/>
-          <w:szCs w:val="22"/>
-          <w:lang w:val="pt-BR"/>
-        </w:rPr>
-        <w:t xml:space="preserve">s notas </w:t>
-      </w:r>
-      <w:r>
-        <w:rPr>
-          <w:rFonts w:ascii="Arial" w:hAnsi="Arial" w:cs="Arial"/>
-          <w:sz w:val="22"/>
-          <w:szCs w:val="22"/>
-          <w:lang w:val="pt-BR"/>
-        </w:rPr>
-        <w:t>de consenso segue</w:t>
-      </w:r>
-      <w:r>
-        <w:rPr>
-          <w:rFonts w:ascii="Arial" w:hAnsi="Arial" w:cs="Arial"/>
-          <w:sz w:val="22"/>
-          <w:szCs w:val="22"/>
-          <w:lang w:val="pt-BR"/>
-        </w:rPr>
-        <w:t>m</w:t>
-      </w:r>
-      <w:r>
-        <w:rPr>
-          <w:rFonts w:ascii="Arial" w:hAnsi="Arial" w:cs="Arial"/>
-          <w:sz w:val="22"/>
-          <w:szCs w:val="22"/>
-          <w:lang w:val="pt-BR"/>
-        </w:rPr>
-        <w:t xml:space="preserve"> em um formulário separado, juntamente com as </w:t>
-      </w:r>
-      <w:r>
-        <w:rPr>
-          <w:rFonts w:ascii="Arial" w:hAnsi="Arial" w:cs="Arial"/>
-          <w:sz w:val="22"/>
-          <w:szCs w:val="22"/>
-          <w:lang w:val="pt-BR"/>
-        </w:rPr>
-        <w:t>notas</w:t>
-      </w:r>
-      <w:r>
-        <w:rPr>
-          <w:rFonts w:ascii="Arial" w:hAnsi="Arial" w:cs="Arial"/>
-          <w:sz w:val="22"/>
-          <w:szCs w:val="22"/>
-          <w:lang w:val="pt-BR"/>
-        </w:rPr>
-        <w:t xml:space="preserve"> individuais de cada </w:t>
-      </w:r>
-      <w:r>
-        <w:rPr>
-          <w:rFonts w:ascii="Arial" w:hAnsi="Arial" w:cs="Arial"/>
-          <w:sz w:val="22"/>
-          <w:szCs w:val="22"/>
-          <w:lang w:val="pt-BR"/>
-        </w:rPr>
-        <w:t>P</w:t>
-      </w:r>
-      <w:r>
-        <w:rPr>
-          <w:rFonts w:ascii="Arial" w:hAnsi="Arial" w:cs="Arial"/>
-          <w:sz w:val="22"/>
-          <w:szCs w:val="22"/>
-          <w:lang w:val="pt-BR"/>
-        </w:rPr>
-        <w:t>roctor</w:t>
-      </w:r>
-      <w:r>
-        <w:rPr>
-          <w:rFonts w:ascii="Arial" w:hAnsi="Arial" w:cs="Arial"/>
-          <w:sz w:val="22"/>
-          <w:szCs w:val="22"/>
-          <w:lang w:val="pt-BR"/>
-        </w:rPr>
-        <w:t>.</w:t>
+        <w:t>Depois que você e o(s) outro(s) Proctor(s) terminarem suas súmulas, vocês devem chegar em uma nota de consenso para cada cerveja. Em algumas configurações de exame, por exemplo, quando os Proctors estão sentados ao lado dos Candidatos, pode ser melhor esperar até que o exame propriamente dito seja concluído para atribuir as notas de consenso para evitar perturbar os Candidatos ou divulgar inadvertidamente detalhes sobre as amostras aos Candidatos. As notas de consenso seguem em um formulário separado, juntamente com as notas individuais de cada Proctor.</w:t>
+      </w:r>
+      <w:r>
+        <w:rPr>
+          <w:rFonts w:ascii="Arial" w:hAnsi="Arial" w:cs="Arial"/>
+          <w:sz w:val="22"/>
+          <w:szCs w:val="22"/>
+          <w:lang w:val="pt-BR"/>
+        </w:rPr>
+      </w:r>
+      <w:r>
+        <w:rPr>
+          <w:rFonts w:ascii="Arial" w:hAnsi="Arial" w:cs="Arial"/>
+          <w:sz w:val="22"/>
+          <w:szCs w:val="22"/>
+          <w:lang w:val="pt-BR"/>
+        </w:rPr>
+      </w:r>
+      <w:r>
+        <w:rPr>
+          <w:rFonts w:ascii="Arial" w:hAnsi="Arial" w:cs="Arial"/>
+          <w:sz w:val="22"/>
+          <w:szCs w:val="22"/>
+          <w:lang w:val="pt-BR"/>
+        </w:rPr>
+      </w:r>
+      <w:r>
+        <w:rPr>
+          <w:rFonts w:ascii="Arial" w:hAnsi="Arial" w:cs="Arial"/>
+          <w:sz w:val="22"/>
+          <w:szCs w:val="22"/>
+          <w:lang w:val="pt-BR"/>
+        </w:rPr>
+      </w:r>
+      <w:r>
+        <w:rPr>
+          <w:rFonts w:ascii="Arial" w:hAnsi="Arial" w:cs="Arial"/>
+          <w:sz w:val="22"/>
+          <w:szCs w:val="22"/>
+          <w:lang w:val="pt-BR"/>
+        </w:rPr>
+      </w:r>
+      <w:r>
+        <w:rPr>
+          <w:rFonts w:ascii="Arial" w:hAnsi="Arial" w:cs="Arial"/>
+          <w:sz w:val="22"/>
+          <w:szCs w:val="22"/>
+          <w:lang w:val="pt-BR"/>
+        </w:rPr>
+      </w:r>
+      <w:r>
+        <w:rPr>
+          <w:rFonts w:ascii="Arial" w:hAnsi="Arial" w:cs="Arial"/>
+          <w:sz w:val="22"/>
+          <w:szCs w:val="22"/>
+          <w:lang w:val="pt-BR"/>
+        </w:rPr>
+      </w:r>
+      <w:r>
+        <w:rPr>
+          <w:rFonts w:ascii="Arial" w:hAnsi="Arial" w:cs="Arial"/>
+          <w:sz w:val="22"/>
+          <w:szCs w:val="22"/>
+          <w:lang w:val="pt-BR"/>
+        </w:rPr>
+      </w:r>
+      <w:r>
+        <w:rPr>
+          <w:rFonts w:ascii="Arial" w:hAnsi="Arial" w:cs="Arial"/>
+          <w:sz w:val="22"/>
+          <w:szCs w:val="22"/>
+          <w:lang w:val="pt-BR"/>
+        </w:rPr>
+      </w:r>
+      <w:r>
+        <w:rPr>
+          <w:rFonts w:ascii="Arial" w:hAnsi="Arial" w:cs="Arial"/>
+          <w:sz w:val="22"/>
+          <w:szCs w:val="22"/>
+          <w:lang w:val="pt-BR"/>
+        </w:rPr>
+      </w:r>
+      <w:r>
+        <w:rPr>
+          <w:rFonts w:ascii="Arial" w:hAnsi="Arial" w:cs="Arial"/>
+          <w:sz w:val="22"/>
+          <w:szCs w:val="22"/>
+          <w:lang w:val="pt-BR"/>
+        </w:rPr>
+      </w:r>
+      <w:r>
+        <w:rPr>
+          <w:rFonts w:ascii="Arial" w:hAnsi="Arial" w:cs="Arial"/>
+          <w:sz w:val="22"/>
+          <w:szCs w:val="22"/>
+          <w:lang w:val="pt-BR"/>
+        </w:rPr>
+      </w:r>
+      <w:r>
+        <w:rPr>
+          <w:rFonts w:ascii="Arial" w:hAnsi="Arial" w:cs="Arial"/>
+          <w:sz w:val="22"/>
+          <w:szCs w:val="22"/>
+          <w:lang w:val="pt-BR"/>
+        </w:rPr>
+      </w:r>
+      <w:r>
+        <w:rPr>
+          <w:rFonts w:ascii="Arial" w:hAnsi="Arial" w:cs="Arial"/>
+          <w:sz w:val="22"/>
+          <w:szCs w:val="22"/>
+          <w:lang w:val="pt-BR"/>
+        </w:rPr>
+      </w:r>
+      <w:r>
+        <w:rPr>
+          <w:rFonts w:ascii="Arial" w:hAnsi="Arial" w:cs="Arial"/>
+          <w:sz w:val="22"/>
+          <w:szCs w:val="22"/>
+          <w:lang w:val="pt-BR"/>
+        </w:rPr>
+      </w:r>
+      <w:r>
+        <w:rPr>
+          <w:rFonts w:ascii="Arial" w:hAnsi="Arial" w:cs="Arial"/>
+          <w:sz w:val="22"/>
+          <w:szCs w:val="22"/>
+          <w:lang w:val="pt-BR"/>
+        </w:rPr>
+      </w:r>
+      <w:r>
+        <w:rPr>
+          <w:rFonts w:ascii="Arial" w:hAnsi="Arial" w:cs="Arial"/>
+          <w:sz w:val="22"/>
+          <w:szCs w:val="22"/>
+          <w:lang w:val="pt-BR"/>
+        </w:rPr>
+      </w:r>
+      <w:r>
+        <w:rPr>
+          <w:rFonts w:ascii="Arial" w:hAnsi="Arial" w:cs="Arial"/>
+          <w:sz w:val="22"/>
+          <w:szCs w:val="22"/>
+          <w:lang w:val="pt-BR"/>
+        </w:rPr>
+      </w:r>
+      <w:r>
+        <w:rPr>
+          <w:rFonts w:ascii="Arial" w:hAnsi="Arial" w:cs="Arial"/>
+          <w:sz w:val="22"/>
+          <w:szCs w:val="22"/>
+          <w:lang w:val="pt-BR"/>
+        </w:rPr>
+      </w:r>
+      <w:r>
+        <w:rPr>
+          <w:rFonts w:ascii="Arial" w:hAnsi="Arial" w:cs="Arial"/>
+          <w:sz w:val="22"/>
+          <w:szCs w:val="22"/>
+          <w:lang w:val="pt-BR"/>
+        </w:rPr>
+      </w:r>
+      <w:r>
+        <w:rPr>
+          <w:rFonts w:ascii="Arial" w:hAnsi="Arial" w:cs="Arial"/>
+          <w:sz w:val="22"/>
+          <w:szCs w:val="22"/>
+          <w:lang w:val="pt-BR"/>
+        </w:rPr>
+      </w:r>
+      <w:r>
+        <w:rPr>
+          <w:rFonts w:ascii="Arial" w:hAnsi="Arial" w:cs="Arial"/>
+          <w:sz w:val="22"/>
+          <w:szCs w:val="22"/>
+          <w:lang w:val="pt-BR"/>
+        </w:rPr>
+      </w:r>
+      <w:r>
+        <w:rPr>
+          <w:rFonts w:ascii="Arial" w:hAnsi="Arial" w:cs="Arial"/>
+          <w:sz w:val="22"/>
+          <w:szCs w:val="22"/>
+          <w:lang w:val="pt-BR"/>
+        </w:rPr>
+      </w:r>
+      <w:r>
+        <w:rPr>
+          <w:rFonts w:ascii="Arial" w:hAnsi="Arial" w:cs="Arial"/>
+          <w:sz w:val="22"/>
+          <w:szCs w:val="22"/>
+          <w:lang w:val="pt-BR"/>
+        </w:rPr>
+      </w:r>
+      <w:r>
+        <w:rPr>
+          <w:rFonts w:ascii="Arial" w:hAnsi="Arial" w:cs="Arial"/>
+          <w:sz w:val="22"/>
+          <w:szCs w:val="22"/>
+          <w:lang w:val="pt-BR"/>
+        </w:rPr>
+      </w:r>
+      <w:r>
+        <w:rPr>
+          <w:rFonts w:ascii="Arial" w:hAnsi="Arial" w:cs="Arial"/>
+          <w:sz w:val="22"/>
+          <w:szCs w:val="22"/>
+          <w:lang w:val="pt-BR"/>
+        </w:rPr>
+      </w:r>
+      <w:r>
+        <w:rPr>
+          <w:rFonts w:ascii="Arial" w:hAnsi="Arial" w:cs="Arial"/>
+          <w:sz w:val="22"/>
+          <w:szCs w:val="22"/>
+          <w:lang w:val="pt-BR"/>
+        </w:rPr>
+      </w:r>
+      <w:r>
+        <w:rPr>
+          <w:rFonts w:ascii="Arial" w:hAnsi="Arial" w:cs="Arial"/>
+          <w:sz w:val="22"/>
+          <w:szCs w:val="22"/>
+          <w:lang w:val="pt-BR"/>
+        </w:rPr>
+      </w:r>
+      <w:r>
+        <w:rPr>
+          <w:rFonts w:ascii="Arial" w:hAnsi="Arial" w:cs="Arial"/>
+          <w:sz w:val="22"/>
+          <w:szCs w:val="22"/>
+          <w:lang w:val="pt-BR"/>
+        </w:rPr>
+      </w:r>
+      <w:r>
+        <w:rPr>
+          <w:rFonts w:ascii="Arial" w:hAnsi="Arial" w:cs="Arial"/>
+          <w:sz w:val="22"/>
+          <w:szCs w:val="22"/>
+          <w:lang w:val="pt-BR"/>
+        </w:rPr>
+      </w:r>
+      <w:r>
+        <w:rPr>
+          <w:rFonts w:ascii="Arial" w:hAnsi="Arial" w:cs="Arial"/>
+          <w:sz w:val="22"/>
+          <w:szCs w:val="22"/>
+          <w:lang w:val="pt-BR"/>
+        </w:rPr>
+      </w:r>
+      <w:r>
+        <w:rPr>
+          <w:rFonts w:ascii="Arial" w:hAnsi="Arial" w:cs="Arial"/>
+          <w:sz w:val="22"/>
+          <w:szCs w:val="22"/>
+          <w:lang w:val="pt-BR"/>
+        </w:rPr>
+      </w:r>
+      <w:r>
+        <w:rPr>
+          <w:rFonts w:ascii="Arial" w:hAnsi="Arial" w:cs="Arial"/>
+          <w:sz w:val="22"/>
+          <w:szCs w:val="22"/>
+          <w:lang w:val="pt-BR"/>
+        </w:rPr>
+      </w:r>
+      <w:r>
+        <w:rPr>
+          <w:rFonts w:ascii="Arial" w:hAnsi="Arial" w:cs="Arial"/>
+          <w:sz w:val="22"/>
+          <w:szCs w:val="22"/>
+          <w:lang w:val="pt-BR"/>
+        </w:rPr>
+      </w:r>
+      <w:r>
+        <w:rPr>
+          <w:rFonts w:ascii="Arial" w:hAnsi="Arial" w:cs="Arial"/>
+          <w:sz w:val="22"/>
+          <w:szCs w:val="22"/>
+          <w:lang w:val="pt-BR"/>
+        </w:rPr>
+      </w:r>
+      <w:r>
+        <w:rPr>
+          <w:rFonts w:ascii="Arial" w:hAnsi="Arial" w:cs="Arial"/>
+          <w:sz w:val="22"/>
+          <w:szCs w:val="22"/>
+          <w:lang w:val="pt-BR"/>
+        </w:rPr>
+      </w:r>
+      <w:r>
+        <w:rPr>
+          <w:rFonts w:ascii="Arial" w:hAnsi="Arial" w:cs="Arial"/>
+          <w:sz w:val="22"/>
+          <w:szCs w:val="22"/>
+          <w:lang w:val="pt-BR"/>
+        </w:rPr>
+      </w:r>
+      <w:r>
+        <w:rPr>
+          <w:rFonts w:ascii="Arial" w:hAnsi="Arial" w:cs="Arial"/>
+          <w:sz w:val="22"/>
+          <w:szCs w:val="22"/>
+          <w:lang w:val="pt-BR"/>
+        </w:rPr>
+      </w:r>
+      <w:r>
+        <w:rPr>
+          <w:rFonts w:ascii="Arial" w:hAnsi="Arial" w:cs="Arial"/>
+          <w:sz w:val="22"/>
+          <w:szCs w:val="22"/>
+          <w:lang w:val="pt-BR"/>
+        </w:rPr>
+      </w:r>
+      <w:r>
+        <w:rPr>
+          <w:rFonts w:ascii="Arial" w:hAnsi="Arial" w:cs="Arial"/>
+          <w:sz w:val="22"/>
+          <w:szCs w:val="22"/>
+          <w:lang w:val="pt-BR"/>
+        </w:rPr>
+      </w:r>
+      <w:r>
+        <w:rPr>
+          <w:rFonts w:ascii="Arial" w:hAnsi="Arial" w:cs="Arial"/>
+          <w:sz w:val="22"/>
+          <w:szCs w:val="22"/>
+          <w:lang w:val="pt-BR"/>
+        </w:rPr>
+      </w:r>
+      <w:r>
+        <w:rPr>
+          <w:rFonts w:ascii="Arial" w:hAnsi="Arial" w:cs="Arial"/>
+          <w:sz w:val="22"/>
+          <w:szCs w:val="22"/>
+          <w:lang w:val="pt-BR"/>
+        </w:rPr>
+      </w:r>
+      <w:r>
+        <w:rPr>
+          <w:rFonts w:ascii="Arial" w:hAnsi="Arial" w:cs="Arial"/>
+          <w:sz w:val="22"/>
+          <w:szCs w:val="22"/>
+          <w:lang w:val="pt-BR"/>
+        </w:rPr>
+      </w:r>
+      <w:r>
+        <w:rPr>
+          <w:rFonts w:ascii="Arial" w:hAnsi="Arial" w:cs="Arial"/>
+          <w:sz w:val="22"/>
+          <w:szCs w:val="22"/>
+          <w:lang w:val="pt-BR"/>
+        </w:rPr>
+      </w:r>
+      <w:r>
+        <w:rPr>
+          <w:rFonts w:ascii="Arial" w:hAnsi="Arial" w:cs="Arial"/>
+          <w:sz w:val="22"/>
+          <w:szCs w:val="22"/>
+          <w:lang w:val="pt-BR"/>
+        </w:rPr>
+      </w:r>
+      <w:r>
+        <w:rPr>
+          <w:rFonts w:ascii="Arial" w:hAnsi="Arial" w:cs="Arial"/>
+          <w:sz w:val="22"/>
+          <w:szCs w:val="22"/>
+          <w:lang w:val="pt-BR"/>
+        </w:rPr>
+      </w:r>
+      <w:r>
+        <w:rPr>
+          <w:rFonts w:ascii="Arial" w:hAnsi="Arial" w:cs="Arial"/>
+          <w:sz w:val="22"/>
+          <w:szCs w:val="22"/>
+          <w:lang w:val="pt-BR"/>
+        </w:rPr>
+      </w:r>
+      <w:r>
+        <w:rPr>
+          <w:rFonts w:ascii="Arial" w:hAnsi="Arial" w:cs="Arial"/>
+          <w:sz w:val="22"/>
+          <w:szCs w:val="22"/>
+          <w:lang w:val="pt-BR"/>
+        </w:rPr>
+      </w:r>
+      <w:r>
+        <w:rPr>
+          <w:rFonts w:ascii="Arial" w:hAnsi="Arial" w:cs="Arial"/>
+          <w:sz w:val="22"/>
+          <w:szCs w:val="22"/>
+          <w:lang w:val="pt-BR"/>
+        </w:rPr>
+      </w:r>
+      <w:r>
+        <w:rPr>
+          <w:rFonts w:ascii="Arial" w:hAnsi="Arial" w:cs="Arial"/>
+          <w:sz w:val="22"/>
+          <w:szCs w:val="22"/>
+          <w:lang w:val="pt-BR"/>
+        </w:rPr>
+      </w:r>
+      <w:r>
+        <w:rPr>
+          <w:rFonts w:ascii="Arial" w:hAnsi="Arial" w:cs="Arial"/>
+          <w:sz w:val="22"/>
+          <w:szCs w:val="22"/>
+          <w:lang w:val="pt-BR"/>
+        </w:rPr>
+      </w:r>
+      <w:r>
+        <w:rPr>
+          <w:rFonts w:ascii="Arial" w:hAnsi="Arial" w:cs="Arial"/>
+          <w:sz w:val="22"/>
+          <w:szCs w:val="22"/>
+          <w:lang w:val="pt-BR"/>
+        </w:rPr>
       </w:r>
     </w:p>
     <w:p>
@@ -2402,7 +2322,7 @@
           <w:szCs w:val="22"/>
           <w:lang w:val="pt-BR"/>
         </w:rPr>
-        <w:t xml:space="preserve">Há apenas duas ocasiões em que o BJCP oficialmente vê as súmulas de pontuação que você gera; a primeira é quando você faz o exame e a segunda é quando você se voluntaria para ajudar a supervisionar/ser Proctor de um exame do BJCP. Em troca de julgar as sidras do exame você recebe pontos de experiência, em troca o BJCP espera uma súmula muito completa. O BJCP reserva o direito de reter alguns ou todos os pontos de experiência se você não </w:t>
+        <w:t>Há apenas duas ocasiões em que o BJCP oficialmente vê as súmulas de pontuação que você gera; a primeira é quando você faz o exame e a segunda é quando você se voluntaria para ajudar a supervisionar/ser Proctor de um exame do BJCP. Em troca de julgar as cervejas do exame você recebe pontos de experiência, em troca o BJCP espera uma súmula muito completa. O BJCP reserva o direito de reter alguns ou todos os pontos de experiência se você não fornecer um conjunto adequado de súmulas.</w:t>
       </w:r>
       <w:proofErr w:type="spellStart"/>
       <w:r>
@@ -2412,7 +2332,6 @@
           <w:szCs w:val="22"/>
           <w:lang w:val="pt-BR"/>
         </w:rPr>
-        <w:t>fornecer</w:t>
       </w:r>
       <w:proofErr w:type="spellEnd"/>
       <w:r>
@@ -2422,7 +2341,6 @@
           <w:szCs w:val="22"/>
           <w:lang w:val="pt-BR"/>
         </w:rPr>
-        <w:t xml:space="preserve"> um conjunto adequado de súmulas.</w:t>
       </w:r>
     </w:p>
     <w:p>

</xml_diff>